<commit_message>
Correct the Huguen journal title to Marine Geophysical Researches
The article's own page 61 header reads "Marine Geophysical Researches (2006)
27: 61-75". The base document dropped the "es" - the journal only became
Marine Geophysical Research in 2010, after this volume. Fixed in both the
reference list and the footnote, via a document-wide text fix so the
bibliography is covered too.

Re-checked every p. 61 citation against the article text: the abstract and
the whole introduction sit on that page, and each claim resolves there -
the >3 cm/yr rate, the >1500 km by 200-250 km dimensions, the 12 km
sediment pile, the 2 km of Messinian evaporites, the survey methods, the
Mesozoic remnant basin, and the three controlling factors.

Co-Authored-By: Claude Opus 5 <noreply@anthropic.com>
Claude-Session: https://claude.ai/code/session_01582LjoChtA5sSmS6QS1jcU
</commit_message>
<xml_diff>
--- a/hellenic_arc_paper/עבודת_סיכום_הקשת_ההלנית.docx
+++ b/hellenic_arc_paper/עבודת_סיכום_הקשת_ההלנית.docx
@@ -2710,7 +2710,7 @@
           <w:szCs w:val="22"/>
           <w:rtl w:val="0"/>
         </w:rPr>
-        <w:t xml:space="preserve">Huguen, C., Chamot-Rooke, N., Loubrieu, B., &amp; Mascle, J. (2006). Morphology of a pre-collisional, salt-bearing, accretionary complex: The Mediterranean Ridge (Eastern Mediterranean). Marine Geophysical Research, 27(1), 61–75. https://doi.org/10.1007/s11001-005-5026-5</w:t>
+        <w:t xml:space="preserve">Huguen, C., Chamot-Rooke, N., Loubrieu, B., &amp; Mascle, J. (2006). Morphology of a pre-collisional, salt-bearing, accretionary complex: The Mediterranean Ridge (Eastern Mediterranean). Marine Geophysical Researches, 27(1), 61–75. https://doi.org/10.1007/s11001-005-5026-5</w:t>
       </w:r>
     </w:p>
     <w:p>
@@ -2875,7 +2875,7 @@
           <w:szCs w:val="20"/>
           <w:rtl/>
         </w:rPr>
-        <w:t xml:space="preserve"> Huguen, C., Chamot-Rooke, N., Loubrieu, B., &amp; Mascle, J. (2006). Morphology of a pre-collisional, salt-bearing, accretionary complex: The Mediterranean Ridge (Eastern Mediterranean). Marine Geophysical Research, 27(1), 61–75. עמ' 61 (תקציר ומבוא).</w:t>
+        <w:t xml:space="preserve"> Huguen, C., Chamot-Rooke, N., Loubrieu, B., &amp; Mascle, J. (2006). Morphology of a pre-collisional, salt-bearing, accretionary complex: The Mediterranean Ridge (Eastern Mediterranean). Marine Geophysical Researches, 27(1), 61–75. עמ' 61 (תקציר ומבוא).</w:t>
       </w:r>
     </w:p>
   </w:footnote>

</xml_diff>

<commit_message>
Add citation verification document and fix Kopf footnote locator
Footnote 5 backed the claim "fastest growing accretionary prism in the
world" with the Kopf et al. (2003) abstract, which does not state it.
Repointed it to paragraph 2 (section 1, Introduction), which does.

Adds a separate verification document listing all 57 footnotes with
source, locator, the Hebrew claim, and the verbatim English quote it
rests on. It is a working tool, not part of the submission: the
assignment forbids appendices and caps the paper at 10 pages.

build_verification.py checks every quote against the source PDF before
writing it - against the printed page for Huguen and Gunes, against the
AGU paragraph span for Kopf and Royden - and fails the build if a quote
is absent from the location its locator claims. All 53 quotes pass.

Co-Authored-By: Claude Opus 5 <noreply@anthropic.com>
Claude-Session: https://claude.ai/code/session_01582LjoChtA5sSmS6QS1jcU
</commit_message>
<xml_diff>
--- a/hellenic_arc_paper/עבודת_סיכום_הקשת_ההלנית.docx
+++ b/hellenic_arc_paper/עבודת_סיכום_הקשת_ההלנית.docx
@@ -2827,7 +2827,7 @@
           <w:szCs w:val="22"/>
           <w:rtl w:val="0"/>
         </w:rPr>
-        <w:t xml:space="preserve">Güneş, P., Aksu, A. E., &amp; Hall, J. (2018). Internal seismic stratigraphy of the Messinian evaporites across the eastern Mediterranean Sea. Marine and Petroleum Geology, 91, 297–320. https://doi.org/10.1016/j.marpetgeo.2018.01.010</w:t>
+        <w:t xml:space="preserve">Güneş, P., Aksu, A. E., &amp; Hall, J. (2018). Internal seismic stratigraphy of the Messinian evaporites across the northern sector of the eastern Mediterranean Sea. Marine and Petroleum Geology, 91, 297–320. https://doi.org/10.1016/j.marpetgeo.2018.01.010</w:t>
       </w:r>
       <w:r>
         <w:rPr>
@@ -3156,7 +3156,7 @@
           <w:szCs w:val="20"/>
           <w:rtl/>
         </w:rPr>
-        <w:t xml:space="preserve"> Kopf, A., Mascle, J., &amp; Klaeschen, D. (2003). The Mediterranean Ridge: A mass balance across the fastest growing accretionary complex on Earth. Journal of Geophysical Research: Solid Earth, 108(B8), 2372. תקציר (פס' 1).</w:t>
+        <w:t xml:space="preserve"> Kopf, A., Mascle, J., &amp; Klaeschen, D. (2003). The Mediterranean Ridge: A mass balance across the fastest growing accretionary complex on Earth. Journal of Geophysical Research: Solid Earth, 108(B8), 2372. פס' 2 (סעיף 1, Introduction).</w:t>
       </w:r>
     </w:p>
   </w:footnote>
@@ -3892,7 +3892,7 @@
           <w:szCs w:val="20"/>
           <w:rtl/>
         </w:rPr>
-        <w:t xml:space="preserve"> Güneş, P., Aksu, A. E., &amp; Hall, J. (2018). Internal seismic stratigraphy of the Messinian evaporites across the eastern Mediterranean Sea. Marine and Petroleum Geology, 91, 297–320. איור 21, עמ' 315; הפאנל המערבי שבו לקוח אצל המחברים מ-Dal Cin et al. (2016).</w:t>
+        <w:t xml:space="preserve"> Güneş, P., Aksu, A. E., &amp; Hall, J. (2018). Internal seismic stratigraphy of the Messinian evaporites across the northern sector of the eastern Mediterranean Sea. Marine and Petroleum Geology, 91, 297–320. איור 21, עמ' 315; הפאנל המערבי שבו לקוח אצל המחברים מ-Dal Cin et al. (2016).</w:t>
       </w:r>
     </w:p>
   </w:footnote>

</xml_diff>